<commit_message>
feat: conclui compliance e alertas web push
</commit_message>
<xml_diff>
--- a/docs/Manual-Saude-Perto-de-Voce.docx
+++ b/docs/Manual-Saude-Perto-de-Voce.docx
@@ -42,17 +42,19 @@
     </w:p>
     <w:tbl>
       <w:tblPr>
-        <w:tblW w:type="auto" w:w="0"/>
+        <w:tblW w:type="dxa" w:w="9360"/>
         <w:jc w:val="left"/>
         <w:tblLayout w:type="fixed"/>
         <w:tblLook w:firstColumn="1" w:firstRow="1" w:lastColumn="0" w:lastRow="0" w:noHBand="0" w:noVBand="1" w:val="04A0"/>
-        <w:tblW w:w="9360" w:type="dxa"/>
-        <w:tblInd w:w="120" w:type="dxa"/>
+        <w:tblInd w:w="260" w:type="dxa"/>
       </w:tblPr>
       <w:tblGrid>
         <w:gridCol w:w="9360"/>
       </w:tblGrid>
       <w:tr>
+        <w:trPr>
+          <w:tblHeader w:val="true"/>
+        </w:trPr>
         <w:tc>
           <w:tcPr>
             <w:tcW w:type="dxa" w:w="9360"/>
@@ -140,11 +142,10 @@
     </w:p>
     <w:tbl>
       <w:tblPr>
-        <w:tblW w:type="auto" w:w="0"/>
+        <w:tblW w:type="dxa" w:w="9360"/>
         <w:jc w:val="left"/>
         <w:tblLayout w:type="fixed"/>
         <w:tblLook w:firstColumn="1" w:firstRow="1" w:lastColumn="0" w:lastRow="0" w:noHBand="0" w:noVBand="1" w:val="04A0"/>
-        <w:tblW w:w="9360" w:type="dxa"/>
         <w:tblInd w:w="120" w:type="dxa"/>
       </w:tblPr>
       <w:tblGrid>
@@ -153,6 +154,9 @@
         <w:gridCol w:w="3460"/>
       </w:tblGrid>
       <w:tr>
+        <w:trPr>
+          <w:tblHeader w:val="true"/>
+        </w:trPr>
         <w:tc>
           <w:tcPr>
             <w:tcW w:type="dxa" w:w="1900"/>
@@ -472,16 +476,18 @@
     </w:tbl>
     <w:tbl>
       <w:tblPr>
-        <w:tblW w:type="auto" w:w="0"/>
+        <w:tblW w:type="dxa" w:w="9360"/>
         <w:tblLayout w:type="fixed"/>
         <w:tblLook w:firstColumn="1" w:firstRow="1" w:lastColumn="0" w:lastRow="0" w:noHBand="0" w:noVBand="1" w:val="04A0"/>
-        <w:tblW w:w="9360" w:type="dxa"/>
-        <w:tblInd w:w="120" w:type="dxa"/>
+        <w:tblInd w:w="210" w:type="dxa"/>
       </w:tblPr>
       <w:tblGrid>
         <w:gridCol w:w="9360"/>
       </w:tblGrid>
       <w:tr>
+        <w:trPr>
+          <w:tblHeader w:val="true"/>
+        </w:trPr>
         <w:tc>
           <w:tcPr>
             <w:tcW w:type="dxa" w:w="9360"/>
@@ -557,7 +563,7 @@
     </w:p>
     <w:p>
       <w:r>
-        <w:t>A consulta pública atende à obrigação de transparência prevista na Lei nº 14.654/2023. O MVP atualiza a visão operacional a cada movimentação, superando a frequência mínima quinzenal exigida pela lei.</w:t>
+        <w:t>A consulta pública apoia o atendimento à obrigação de transparência prevista na Lei nº 14.654/2023. A data exibida vem da última movimentação real do inventário, e não do momento da consulta. O município continua responsável por alimentar, conferir e publicar o estoque pelo menos a cada quinze dias.</w:t>
       </w:r>
     </w:p>
     <w:p>
@@ -581,7 +587,7 @@
         <w:pStyle w:val="ListNumber"/>
       </w:pPr>
       <w:r>
-        <w:t>Crie uma senha com pelo menos oito caracteres.</w:t>
+        <w:t>Crie uma senha com pelo menos dez caracteres, combinando letras e números.</w:t>
       </w:r>
     </w:p>
     <w:p>
@@ -605,21 +611,23 @@
         <w:pStyle w:val="ListNumber"/>
       </w:pPr>
       <w:r>
-        <w:t>Após a validação, a entrega domiciliar pode ser habilitada conforme as regras municipais.</w:t>
+        <w:t>A entrega domiciliar só é liberada depois de duas etapas: documentos validados e primeira retirada presencial concluída.</w:t>
       </w:r>
     </w:p>
     <w:tbl>
       <w:tblPr>
-        <w:tblW w:type="auto" w:w="0"/>
+        <w:tblW w:type="dxa" w:w="9360"/>
         <w:tblLayout w:type="fixed"/>
         <w:tblLook w:firstColumn="1" w:firstRow="1" w:lastColumn="0" w:lastRow="0" w:noHBand="0" w:noVBand="1" w:val="04A0"/>
-        <w:tblW w:w="9360" w:type="dxa"/>
-        <w:tblInd w:w="120" w:type="dxa"/>
+        <w:tblInd w:w="210" w:type="dxa"/>
       </w:tblPr>
       <w:tblGrid>
         <w:gridCol w:w="9360"/>
       </w:tblGrid>
       <w:tr>
+        <w:trPr>
+          <w:tblHeader w:val="true"/>
+        </w:trPr>
         <w:tc>
           <w:tcPr>
             <w:tcW w:type="dxa" w:w="9360"/>
@@ -745,7 +753,7 @@
     </w:p>
     <w:p>
       <w:r>
-        <w:t>A página principal destaca consultas pendentes de confirmação e já confirmadas, pedidos recentes, notificações e atalhos. O chat mantém a conversa com a farmácia dentro do sistema, sem depender de WhatsApp.</w:t>
+        <w:t>A página principal destaca consultas pendentes de confirmação e já confirmadas, pedidos recentes, notificações e atalhos. O cidadão pode ativar Web Push em cada aparelho para receber alertas de estoque, solicitações, consultas e mensagens. O chat mantém a conversa com a farmácia dentro do sistema, sem depender de WhatsApp.</w:t>
       </w:r>
     </w:p>
     <w:p>
@@ -758,11 +766,10 @@
     </w:p>
     <w:tbl>
       <w:tblPr>
-        <w:tblW w:type="auto" w:w="0"/>
+        <w:tblW w:type="dxa" w:w="9360"/>
         <w:jc w:val="left"/>
         <w:tblLayout w:type="fixed"/>
         <w:tblLook w:firstColumn="1" w:firstRow="1" w:lastColumn="0" w:lastRow="0" w:noHBand="0" w:noVBand="1" w:val="04A0"/>
-        <w:tblW w:w="9360" w:type="dxa"/>
         <w:tblInd w:w="120" w:type="dxa"/>
       </w:tblPr>
       <w:tblGrid>
@@ -770,6 +777,9 @@
         <w:gridCol w:w="7310"/>
       </w:tblGrid>
       <w:tr>
+        <w:trPr>
+          <w:tblHeader w:val="true"/>
+        </w:trPr>
         <w:tc>
           <w:tcPr>
             <w:tcW w:type="dxa" w:w="2050"/>
@@ -1218,6 +1228,112 @@
                 <w:color w:val="17324D"/>
                 <w:sz w:val="18"/>
               </w:rPr>
+              <w:t>Privacidade</w:t>
+            </w:r>
+          </w:p>
+        </w:tc>
+        <w:tc>
+          <w:tcPr>
+            <w:tcW w:type="dxa" w:w="7310"/>
+            <w:vAlign w:val="center"/>
+            <w:tcMar>
+              <w:top w:w="80" w:type="dxa"/>
+              <w:start w:w="120" w:type="dxa"/>
+              <w:bottom w:w="80" w:type="dxa"/>
+              <w:end w:w="120" w:type="dxa"/>
+            </w:tcMar>
+            <w:shd w:fill="F4F6F9"/>
+          </w:tcPr>
+          <w:p>
+            <w:pPr>
+              <w:spacing w:after="0"/>
+            </w:pPr>
+            <w:r>
+              <w:rPr>
+                <w:rFonts w:ascii="Calibri" w:hAnsi="Calibri"/>
+                <w:color w:val="17324D"/>
+                <w:sz w:val="18"/>
+              </w:rPr>
+              <w:t>Pedidos do titular: acesso, correção, informação e revisão.</w:t>
+            </w:r>
+          </w:p>
+        </w:tc>
+      </w:tr>
+      <w:tr>
+        <w:tc>
+          <w:tcPr>
+            <w:tcW w:type="dxa" w:w="2050"/>
+            <w:vAlign w:val="center"/>
+            <w:tcMar>
+              <w:top w:w="80" w:type="dxa"/>
+              <w:start w:w="120" w:type="dxa"/>
+              <w:bottom w:w="80" w:type="dxa"/>
+              <w:end w:w="120" w:type="dxa"/>
+            </w:tcMar>
+          </w:tcPr>
+          <w:p>
+            <w:pPr>
+              <w:spacing w:after="0"/>
+            </w:pPr>
+            <w:r>
+              <w:rPr>
+                <w:rFonts w:ascii="Calibri" w:hAnsi="Calibri"/>
+                <w:color w:val="17324D"/>
+                <w:sz w:val="18"/>
+              </w:rPr>
+              <w:t>Auditoria</w:t>
+            </w:r>
+          </w:p>
+        </w:tc>
+        <w:tc>
+          <w:tcPr>
+            <w:tcW w:type="dxa" w:w="7310"/>
+            <w:vAlign w:val="center"/>
+            <w:tcMar>
+              <w:top w:w="80" w:type="dxa"/>
+              <w:start w:w="120" w:type="dxa"/>
+              <w:bottom w:w="80" w:type="dxa"/>
+              <w:end w:w="120" w:type="dxa"/>
+            </w:tcMar>
+          </w:tcPr>
+          <w:p>
+            <w:pPr>
+              <w:spacing w:after="0"/>
+            </w:pPr>
+            <w:r>
+              <w:rPr>
+                <w:rFonts w:ascii="Calibri" w:hAnsi="Calibri"/>
+                <w:color w:val="17324D"/>
+                <w:sz w:val="18"/>
+              </w:rPr>
+              <w:t>Eventos sensíveis visíveis a gestores autorizados.</w:t>
+            </w:r>
+          </w:p>
+        </w:tc>
+      </w:tr>
+      <w:tr>
+        <w:tc>
+          <w:tcPr>
+            <w:tcW w:type="dxa" w:w="2050"/>
+            <w:vAlign w:val="center"/>
+            <w:tcMar>
+              <w:top w:w="80" w:type="dxa"/>
+              <w:start w:w="120" w:type="dxa"/>
+              <w:bottom w:w="80" w:type="dxa"/>
+              <w:end w:w="120" w:type="dxa"/>
+            </w:tcMar>
+            <w:shd w:fill="F4F6F9"/>
+          </w:tcPr>
+          <w:p>
+            <w:pPr>
+              <w:spacing w:after="0"/>
+            </w:pPr>
+            <w:r>
+              <w:rPr>
+                <w:rFonts w:ascii="Calibri" w:hAnsi="Calibri"/>
+                <w:color w:val="17324D"/>
+                <w:sz w:val="18"/>
+              </w:rPr>
               <w:t>Equipe</w:t>
             </w:r>
           </w:p>
@@ -1244,7 +1360,7 @@
                 <w:color w:val="17324D"/>
                 <w:sz w:val="18"/>
               </w:rPr>
-              <w:t>Usuários administrativos e acessos controlados.</w:t>
+              <w:t>Usuários por perfil: operador, gestor e administrador geral.</w:t>
             </w:r>
           </w:p>
         </w:tc>
@@ -1271,7 +1387,7 @@
         <w:pStyle w:val="ListNumber"/>
       </w:pPr>
       <w:r>
-        <w:t>Aprovada: o sistema reserva o lote pelo critério FEFO, priorizando a validade mais próxima.</w:t>
+        <w:t>Aprovada: o sistema reserva um lote específico pelo critério FEFO, priorizando a validade mais próxima e não vencida.</w:t>
       </w:r>
     </w:p>
     <w:p>
@@ -1287,7 +1403,15 @@
         <w:pStyle w:val="ListNumber"/>
       </w:pPr>
       <w:r>
-        <w:t>Concluída: registrar a saída física por lote e encerrar o atendimento.</w:t>
+        <w:t>Concluída: consumir exatamente o lote reservado, registrar a saída física e encerrar o atendimento.</w:t>
+      </w:r>
+    </w:p>
+    <w:p>
+      <w:pPr>
+        <w:pStyle w:val="ListNumber"/>
+      </w:pPr>
+      <w:r>
+        <w:t>Não aprovada: exigir motivo, avisar o cidadão e liberar horário e reserva de estoque quando aplicável.</w:t>
       </w:r>
     </w:p>
     <w:p>
@@ -1305,11 +1429,10 @@
     </w:p>
     <w:tbl>
       <w:tblPr>
-        <w:tblW w:type="auto" w:w="0"/>
+        <w:tblW w:type="dxa" w:w="9360"/>
         <w:jc w:val="left"/>
         <w:tblLayout w:type="fixed"/>
         <w:tblLook w:firstColumn="1" w:firstRow="1" w:lastColumn="0" w:lastRow="0" w:noHBand="0" w:noVBand="1" w:val="04A0"/>
-        <w:tblW w:w="9360" w:type="dxa"/>
         <w:tblInd w:w="120" w:type="dxa"/>
       </w:tblPr>
       <w:tblGrid>
@@ -1318,6 +1441,9 @@
         <w:gridCol w:w="5660"/>
       </w:tblGrid>
       <w:tr>
+        <w:trPr>
+          <w:tblHeader w:val="true"/>
+        </w:trPr>
         <w:tc>
           <w:tcPr>
             <w:tcW w:type="dxa" w:w="1800"/>
@@ -1637,7 +1763,7 @@
     </w:tbl>
     <w:p>
       <w:r>
-        <w:t>A situação da consulta pode ser alterada no painel administrativo: planejada, confirmada, concluída ou cancelada. Cada mudança gera aviso aos cidadãos vinculados.</w:t>
+        <w:t>A situação da consulta segue transições controladas: planejada pode ser confirmada ou cancelada; confirmada pode ser concluída ou cancelada; concluída e cancelada são estados finais. Cada mudança gera aviso aos cidadãos vinculados.</w:t>
       </w:r>
     </w:p>
     <w:p>
@@ -1650,11 +1776,10 @@
     </w:p>
     <w:tbl>
       <w:tblPr>
-        <w:tblW w:type="auto" w:w="0"/>
+        <w:tblW w:type="dxa" w:w="9360"/>
         <w:jc w:val="left"/>
         <w:tblLayout w:type="fixed"/>
         <w:tblLook w:firstColumn="1" w:firstRow="1" w:lastColumn="0" w:lastRow="0" w:noHBand="0" w:noVBand="1" w:val="04A0"/>
-        <w:tblW w:w="9360" w:type="dxa"/>
         <w:tblInd w:w="120" w:type="dxa"/>
       </w:tblPr>
       <w:tblGrid>
@@ -1662,6 +1787,9 @@
         <w:gridCol w:w="7460"/>
       </w:tblGrid>
       <w:tr>
+        <w:trPr>
+          <w:tblHeader w:val="true"/>
+        </w:trPr>
         <w:tc>
           <w:tcPr>
             <w:tcW w:type="dxa" w:w="1900"/>
@@ -1950,12 +2078,123 @@
         <w:pStyle w:val="Heading1"/>
       </w:pPr>
       <w:r>
-        <w:t>9. Limites do MVP</w:t>
+        <w:t>9. Privacidade, segurança e compliance</w:t>
+      </w:r>
+    </w:p>
+    <w:p>
+      <w:pPr>
+        <w:pStyle w:val="ListBullet"/>
+      </w:pPr>
+      <w:r>
+        <w:t>Dados de saúde são sensíveis: o acesso é autenticado, o CPF aparece mascarado e senhas/códigos são protegidos por hash.</w:t>
+      </w:r>
+    </w:p>
+    <w:p>
+      <w:pPr>
+        <w:pStyle w:val="ListBullet"/>
+      </w:pPr>
+      <w:r>
+        <w:t>Uploads aceitam apenas PDF, JPG ou PNG de até 5 MB e validam o conteúdo real do arquivo.</w:t>
+      </w:r>
+    </w:p>
+    <w:p>
+      <w:pPr>
+        <w:pStyle w:val="ListBullet"/>
+      </w:pPr>
+      <w:r>
+        <w:t>Cinco falhas de login bloqueiam novas tentativas por quinze minutos.</w:t>
+      </w:r>
+    </w:p>
+    <w:p>
+      <w:pPr>
+        <w:pStyle w:val="ListBullet"/>
+      </w:pPr>
+      <w:r>
+        <w:t>Operadores cuidam da rotina; gestores administram estoque, agendas e privacidade; somente o administrador geral cria acessos.</w:t>
+      </w:r>
+    </w:p>
+    <w:p>
+      <w:pPr>
+        <w:pStyle w:val="ListBullet"/>
+      </w:pPr>
+      <w:r>
+        <w:t>O cidadão pode registrar pedidos de acesso, correção, informação ou revisão na área Privacidade.</w:t>
+      </w:r>
+    </w:p>
+    <w:p>
+      <w:pPr>
+        <w:pStyle w:val="ListBullet"/>
+      </w:pPr>
+      <w:r>
+        <w:t>A consulta pública nunca exibe cidadãos, pedidos, receitas ou dados clínicos.</w:t>
+      </w:r>
+    </w:p>
+    <w:tbl>
+      <w:tblPr>
+        <w:tblW w:type="dxa" w:w="9360"/>
+        <w:tblLayout w:type="fixed"/>
+        <w:tblLook w:firstColumn="1" w:firstRow="1" w:lastColumn="0" w:lastRow="0" w:noHBand="0" w:noVBand="1" w:val="04A0"/>
+        <w:tblInd w:w="210" w:type="dxa"/>
+      </w:tblPr>
+      <w:tblGrid>
+        <w:gridCol w:w="9360"/>
+      </w:tblGrid>
+      <w:tr>
+        <w:trPr>
+          <w:tblHeader w:val="true"/>
+        </w:trPr>
+        <w:tc>
+          <w:tcPr>
+            <w:tcW w:type="dxa" w:w="9360"/>
+            <w:shd w:fill="E7F4EF"/>
+            <w:tcMar>
+              <w:top w:w="170" w:type="dxa"/>
+              <w:start w:w="210" w:type="dxa"/>
+              <w:bottom w:w="170" w:type="dxa"/>
+              <w:end w:w="210" w:type="dxa"/>
+            </w:tcMar>
+          </w:tcPr>
+          <w:p>
+            <w:pPr>
+              <w:spacing w:after="60"/>
+            </w:pPr>
+            <w:r>
+              <w:rPr>
+                <w:rFonts w:ascii="Calibri" w:hAnsi="Calibri"/>
+                <w:b/>
+                <w:color w:val="087A5B"/>
+                <w:sz w:val="20"/>
+              </w:rPr>
+              <w:t>Atenção jurídica</w:t>
+            </w:r>
+          </w:p>
+          <w:p>
+            <w:pPr>
+              <w:spacing w:after="0"/>
+            </w:pPr>
+            <w:r>
+              <w:rPr>
+                <w:rFonts w:ascii="Calibri" w:hAnsi="Calibri"/>
+                <w:color w:val="17324D"/>
+                <w:sz w:val="20"/>
+              </w:rPr>
+              <w:t>O sistema fornece controles técnicos, mas não certifica conformidade isoladamente. Antes da produção, o município deve definir controlador, encarregado, bases legais por finalidade, tabela de retenção, RIPD quando aplicável, contratos, resposta a incidentes e canal alternativo acessível.</w:t>
+            </w:r>
+          </w:p>
+        </w:tc>
+      </w:tr>
+    </w:tbl>
+    <w:p>
+      <w:pPr>
+        <w:pStyle w:val="Heading1"/>
+      </w:pPr>
+      <w:r>
+        <w:t>10. Limites e pré-requisitos de produção</w:t>
       </w:r>
     </w:p>
     <w:p>
       <w:r>
-        <w:t>A versão demonstra experiência, regras e integração dos fluxos. Os dados são fictícios. Para produção municipal serão necessários banco persistente gerenciado, domínio e identidade visual oficiais, política LGPD, rotinas de backup, monitoramento, homologação de segurança e treinamento da equipe.</w:t>
+        <w:t>A versão demonstra experiência, regras e integração dos fluxos com dados fictícios. Os avisos ficam registrados no portal e Web Push funciona quando as chaves VAPID estão configuradas e o cidadão autoriza o aparelho. Para produção municipal são necessários banco e armazenamento persistentes, domínio oficial, identidade visual, rotina de atualização quinzenal comprovável, backup e restauração testados, monitoramento, homologação de segurança, avaliação eMAG/WCAG com pessoas com deficiência, plano de incidentes, política LGPD e treinamento da equipe.</w:t>
       </w:r>
     </w:p>
     <w:sectPr>
@@ -2002,7 +2241,7 @@
         <w:color w:val="637381"/>
         <w:sz w:val="16"/>
       </w:rPr>
-      <w:t>SAÚDE PERTO DE VOCÊ  |  ALTair/SP</w:t>
+      <w:t>SAÚDE PERTO DE VOCÊ  |  ALTAIR/SP</w:t>
     </w:r>
   </w:p>
 </w:hdr>

</xml_diff>